<commit_message>
Supplement 1 in English only, as requested by the editorial office
All Chinese terms, example sentences and the content-audit patterns in Supplement 1
are replaced by English translations; Table S1 now gives the translated terms. The
original Chinese regular expressions and the database search strings are appended
to Supplement_1_classifier.py. New check: no Chinese characters in any uploaded file.

Co-Authored-By: Claude Sonnet 5.5 <noreply@anthropic.com>
Claude-Session: https://claude.ai/code/session_013TkounLTBFVQRstE3VnhkM
</commit_message>
<xml_diff>
--- a/EJR_Supplement_1_NLP_and_report_audit.docx
+++ b/EJR_Supplement_1_NLP_and_report_audit.docx
@@ -24,7 +24,25 @@
         <w:spacing w:after="160"/>
       </w:pPr>
       <w:r>
-        <w:t>Sections A–F specify the classification rules. Section J provides a reference implementation of those rules as a runnable script, together with its agreement with the final adjudicated labels, so that the specification below can be executed rather than only read. Section K describes the manual review of the reference standard, of examination timing and of ultrasound report content.</w:t>
+        <w:t xml:space="preserve">Sections A–F specify the classification rules. Section J provides a reference implementation of those rules as a runnable script, together with its agreement with the final adjudicated labels, so that the specification below can be executed rather than only read. The reports are written in Chinese, so every Chinese term is given in this supplement in English translation; the original Chinese wording of the rules and patterns is deposited unchanged in the script (variables </w:t>
+      </w:r>
+      <w:r>
+        <w:rPr>
+          <w:rFonts w:ascii="Courier New" w:hAnsi="Courier New"/>
+        </w:rPr>
+        <w:t>CONTENT_PATTERNS</w:t>
+      </w:r>
+      <w:r>
+        <w:t xml:space="preserve"> and </w:t>
+      </w:r>
+      <w:r>
+        <w:rPr>
+          <w:rFonts w:ascii="Courier New" w:hAnsi="Courier New"/>
+        </w:rPr>
+        <w:t>OPERATIVE_SEARCH</w:t>
+      </w:r>
+      <w:r>
+        <w:t xml:space="preserve"> at its end, and the rule dictionaries above them). Section K describes the manual review of the reference standard, of examination timing and of ultrasound report content.</w:t>
       </w:r>
     </w:p>
     <w:p>
@@ -56,7 +74,7 @@
         <w:spacing w:after="160"/>
       </w:pPr>
       <w:r>
-        <w:t xml:space="preserve">Each report was split into a findings section (检查所见 / 超声检查所见) and a conclusion section (检查结论 / 超声检查结论). The </w:t>
+        <w:t xml:space="preserve">Each report was split into a findings section (headed "examination findings" or "ultrasound examination findings" in the source reports) and a conclusion section (headed "examination conclusion" or "ultrasound examination conclusion"). The </w:t>
       </w:r>
       <w:r>
         <w:rPr>
@@ -74,7 +92,7 @@
         <w:t>final</w:t>
       </w:r>
       <w:r>
-        <w:t xml:space="preserve"> label used in the analysis is the algorithmic label after blinded adjudication, and adjudication read the whole report, so a sign described only in the findings, or a finding described morphologically without the diagnosis being named, could make a report positive (Section G). The final outcome is therefore "positive under the study definition after adjudication", not "positive conclusion", and the two differ in the seven index units listed in Section J. Conclusions were segmented into clauses at the characters 。；;、and at line breaks. Each clause was evaluated independently, and the report label was the disjunction over clauses (any positive clause makes the report positive), subject to the negation and exclusion rules below.</w:t>
+        <w:t xml:space="preserve"> label used in the analysis is the algorithmic label after blinded adjudication, and adjudication read the whole report, so a sign described only in the findings, or a finding described morphologically without the diagnosis being named, could make a report positive (Section G). The final outcome is therefore "positive under the study definition after adjudication", not "positive conclusion", and the two differ in the seven index units listed in Section J. Conclusions were segmented into clauses at Chinese full stops, semicolons (Chinese and Western forms) and enumeration commas, and at line breaks. Each clause was evaluated independently, and the report label was the disjunction over clauses (any positive clause makes the report positive), subject to the negation and exclusion rules below.</w:t>
       </w:r>
     </w:p>
     <w:p>
@@ -104,7 +122,7 @@
         <w:t>Common to all modalities (diagnosis named):</w:t>
       </w:r>
       <w:r>
-        <w:t xml:space="preserve"> 肠旋转不良 (intestinal malrotation); 中肠旋转不良 (midgut malrotation); 旋转不良 (malrotation); 肠扭转 (intestinal volvulus); 中肠扭转 (midgut volvulus); 肠系膜扭转 (mesenteric volvulus).</w:t>
+        <w:t xml:space="preserve"> "intestinal malrotation"; "midgut malrotation"; "malrotation"; "intestinal volvulus"; "midgut volvulus"; "mesenteric volvulus".</w:t>
       </w:r>
     </w:p>
     <w:p>
@@ -118,7 +136,7 @@
         <w:t>Ultrasound-specific signs:</w:t>
       </w:r>
       <w:r>
-        <w:t xml:space="preserve"> 漩涡征 / 旋涡征 / 涡流 (whirlpool sign); 螺旋 (spiral); 肠系膜上动脉与肠系膜上静脉换位 / 反位 / 倒置 / 关系异常 (inversion or abnormal relationship of the superior mesenteric artery and vein); 静脉位于动脉左侧 (vein to the left of the artery).</w:t>
+        <w:t xml:space="preserve"> "whirlpool sign" (two written forms of the Chinese term) or "eddy flow"; "spiral"; "transposition", "reversed position", "inversion" or "abnormal relationship" of the superior mesenteric artery and vein; "vein located to the left of the artery".</w:t>
       </w:r>
     </w:p>
     <w:p>
@@ -132,7 +150,7 @@
         <w:t>UGI-series-specific signs:</w:t>
       </w:r>
       <w:r>
-        <w:t xml:space="preserve"> 十二指肠空肠曲位置异常 / 位置偏低 / 位于中线 (abnormally positioned duodenojejunal junction); 弹簧征 (spring or corkscrew sign); 螺旋状 / 盘曲 (corkscrew or coiled course of proximal small bowel).</w:t>
+        <w:t xml:space="preserve"> abnormal position of the duodenojejunal junction ("abnormal position", "low position", "located at the midline"); "spring sign" (spring or corkscrew sign); "spiral" or "coiled" course of the proximal small bowel (corkscrew or coiled course).</w:t>
       </w:r>
     </w:p>
     <w:p>
@@ -146,7 +164,7 @@
         <w:t>CT-specific signs:</w:t>
       </w:r>
       <w:r>
-        <w:t xml:space="preserve"> 漩涡征 / 旋涡样改变 (mesenteric whirl); 十二指肠位置异常 (abnormal duodenal position).</w:t>
+        <w:t xml:space="preserve"> "whirlpool sign" or "whirlpool-like change" (mesenteric whirl); "abnormal duodenal position".</w:t>
       </w:r>
     </w:p>
     <w:p>
@@ -184,7 +202,7 @@
         <w:t>Definite</w:t>
       </w:r>
       <w:r>
-        <w:t>: no qualifier (e.g. 中肠旋转不良。 "midgut malrotation.").</w:t>
+        <w:t>: no qualifier (e.g. "midgut malrotation.").</w:t>
       </w:r>
     </w:p>
     <w:p>
@@ -198,7 +216,7 @@
         <w:t>Probable</w:t>
       </w:r>
       <w:r>
-        <w:t>: 多考虑, 首先考虑, 考虑, 倾向, 符合…表现 ("most likely", "first consideration", "consistent with").</w:t>
+        <w:t>: "most likely", "first consideration", "consider", "favor", "consistent with … appearance".</w:t>
       </w:r>
     </w:p>
     <w:p>
@@ -212,7 +230,7 @@
         <w:t>Possible</w:t>
       </w:r>
       <w:r>
-        <w:t>: 可疑, 可能, 不除外, 不排除, 待排, 待除外, 建议…除外/排除/进一步检查, 似, ？/? ("suspected", "cannot be excluded", "recommend further study to exclude", "?").</w:t>
+        <w:t>: "suspected", "possible", "cannot be excluded" (two wordings), "to be excluded" (two wordings), "recommend … exclusion / further examination", "seemingly", and the question mark in its Chinese and Western forms.</w:t>
       </w:r>
     </w:p>
     <w:p>
@@ -242,7 +260,7 @@
         <w:t>E1 Negation.</w:t>
       </w:r>
       <w:r>
-        <w:t xml:space="preserve"> A candidate positive was canceled when a negation cue governed the diagnostic term: 未见 / 未探及 / 未显示 / 未发现 (not seen), 无 / 无明显 (absent), 不考虑 (not considered), 正常 (normal), 阴性 (negative). A cue governs the term only when it stands in the twelve characters preceding it, so 未见明显梗阻征象。中肠旋转不良考虑。 remains positive, and so does 中肠旋转不良术后：未见明显梗阻征象, where the negation governs the obstruction rather than the rotation. 无 is not read as a cue inside 有无 ("whether or not"), which raises the question rather than answering it. 排除 and 除外 are not negation cues in this corpus: every occurrence with the diagnosis is a request to exclude it, which rule E2 treats as raising it.</w:t>
+        <w:t xml:space="preserve"> A candidate positive was canceled when a negation cue governed the diagnostic term: "not seen", "not detected", "not shown", "not found" (four wordings of "not seen"), "absent" ("no", "no obvious"), "not considered", "normal", "negative". A cue governs the term only when it stands in the twelve characters preceding it, so "No obvious signs of obstruction. Midgut malrotation considered." remains positive, and so does "After midgut malrotation surgery: no obvious signs of obstruction", where the negation governs the obstruction rather than the rotation. The cue meaning "no / absent" is not read as a cue inside the compound meaning "whether or not", which raises the question rather than answering it. The two Chinese words for "exclude" are not negation cues in this corpus: every occurrence with the diagnosis is a request to exclude it, which rule E2 treats as raising it.</w:t>
       </w:r>
     </w:p>
     <w:p>
@@ -256,7 +274,7 @@
         <w:t>E2 Distinction between negation and hedged exclusion.</w:t>
       </w:r>
       <w:r>
-        <w:t xml:space="preserve"> 建议进一步检查除外肠旋转不良 ("recommend further study to exclude malrotation") is not a negation: it raises the diagnosis. Such clauses were labeled positive at possible-tier certainty. This rule was applied consistently. It is the most consequential interpretive decision in the algorithm, and it is the reason for the sensitivity analysis in Table 2.</w:t>
+        <w:t xml:space="preserve"> "Recommend further examination to exclude intestinal malrotation" ("recommend further study to exclude malrotation") is not a negation: it raises the diagnosis. Such clauses were labeled positive at possible-tier certainty. This rule was applied consistently. It is the most consequential interpretive decision in the algorithm, and it is the reason for the sensitivity analysis in Table 2.</w:t>
       </w:r>
     </w:p>
     <w:p>
@@ -270,7 +288,7 @@
         <w:t>E3 Organ exclusions.</w:t>
       </w:r>
       <w:r>
-        <w:t xml:space="preserve"> 胃扭转 and 胃翻转 (gastric volvulus / organoaxial gastric rotation) are unrelated to midgut rotation and never make a report positive, even though they contain 扭转. Likewise excluded: 睾丸扭转, 卵巢扭转, 附件扭转, 精索扭转, 大网膜扭转, 阑尾扭转 (testicular, ovarian, adnexal, spermatic-cord, omental and appendiceal torsion). A report may still be positive on other grounds: 中肠旋转不良并十二指肠不全性梗阻考虑。胃翻转。 is positive on its first clause.</w:t>
+        <w:t xml:space="preserve"> "Gastric torsion" and "gastric flipping" (gastric volvulus / organoaxial gastric rotation) are unrelated to midgut rotation and never make a report positive, even though the Chinese terms contain the word for "torsion". Likewise excluded: testicular, ovarian, adnexal, spermatic-cord, omental and appendiceal torsion. A report may still be positive on other grounds: "Midgut malrotation with partial duodenal obstruction considered. Gastric flipping." is positive on its first clause.</w:t>
       </w:r>
     </w:p>
     <w:p>
@@ -429,7 +447,7 @@
         <w:t>Typical failure modes observed:</w:t>
       </w:r>
       <w:r>
-        <w:t xml:space="preserve"> (i) the diagnosis stated only in the findings section and not carried into the conclusion; (ii) a diagnostic sign described morphologically without the diagnosis being named, as in 中上腹异常光团回声，内呈强弱相间的漩涡状回声 ("abnormal mass-like echo in the upper abdomen with alternating whirled echogenicity"), which does not contain the words 旋转不良; (iii) the diagnosis embedded in a long multi-organ conclusion after several unrelated clauses.</w:t>
+        <w:t xml:space="preserve"> (i) the diagnosis stated only in the findings section and not carried into the conclusion; (ii) a diagnostic sign described morphologically without the diagnosis being named, as in "abnormal mass-like echo in the upper abdomen with alternating whirled echogenicity", which does not contain the words for "malrotation"; (iii) the diagnosis embedded in a long multi-organ conclusion after several unrelated clauses.</w:t>
       </w:r>
     </w:p>
     <w:p>
@@ -525,25 +543,16 @@
         <w:spacing w:after="160"/>
       </w:pPr>
       <w:r>
-        <w:t xml:space="preserve">Children were retrieved from the institutional clinical research database by matching, case-insensitively, the operative diagnosis field (术中诊断) against </w:t>
+        <w:t xml:space="preserve">Children were retrieved from the institutional clinical research database by matching, case-insensitively, the operative diagnosis field against the Chinese term for intestinal malrotation or the procedure-name field against "Ladd" (the original field names and strings are in </w:t>
       </w:r>
       <w:r>
         <w:rPr>
           <w:rFonts w:ascii="Courier New" w:hAnsi="Courier New"/>
         </w:rPr>
-        <w:t>肠旋转不良</w:t>
+        <w:t>OPERATIVE_SEARCH</w:t>
       </w:r>
       <w:r>
-        <w:t xml:space="preserve"> or the procedure-name field (手术名称) against </w:t>
-      </w:r>
-      <w:r>
-        <w:rPr>
-          <w:rFonts w:ascii="Courier New" w:hAnsi="Courier New"/>
-        </w:rPr>
-        <w:t>Ladd</w:t>
-      </w:r>
-      <w:r>
-        <w:t>. The institutional clinical research database held 711 children with a recorded diagnosis of intestinal malrotation for the study period, 499 of whom had 559 operative records. Applied to those records, this returns 503 records in 465 children; every retrieved record was read before inclusion, and review of the anchor operation then excluded 15 children (Section K1), leaving 484 records in 450 children. The 34 children not returned had operative diagnoses unrelated to malrotation (appendicitis, hypertrophic pyloric stenosis, Hirschsprung disease, diaphragmatic and cardiac procedures among them).</w:t>
+        <w:t xml:space="preserve"> in the script). The institutional clinical research database held 711 children with a recorded diagnosis of intestinal malrotation for the study period, 499 of whom had 559 operative records. Applied to those records, this returns 503 records in 465 children; every retrieved record was read before inclusion, and review of the anchor operation then excluded 15 children (Section K1), leaving 484 records in 450 children. The 34 children not returned had operative diagnoses unrelated to malrotation (appendicitis, hypertrophic pyloric stenosis, Hirschsprung disease, diaphragmatic and cardiac procedures among them).</w:t>
       </w:r>
     </w:p>
     <w:p>
@@ -559,7 +568,25 @@
         <w:spacing w:after="160"/>
       </w:pPr>
       <w:r>
-        <w:t>Content coding was applied to the concatenated findings and conclusion text of each index unit. For CT and the upper gastrointestinal series it used the patterns below. For ultrasound the patterns were applied first and then replaced by the two-reader manual coding of Section K, because checking them against the reports showed that the vessel pattern also counted mentions of the vessels that did not address their relationship; the ultrasound rows are retained for comparison, and Table S2 gives their agreement with the manual coding. Examination type and bedside performance are taken from the examination name for all modalities. The index unit is the examination episode closest to operation: all reports of that modality issued on that calendar day are pooled, because the department routinely issues separate gastrointestinal and great-vessel reports for one ultrasound session. Patterns are given as regular expressions over the source text. Technique elements (duodenal segments, the mesenteric vessels, enteric fluid, dynamic and compression technique, color Doppler, cecal position) are coded on mention, whether the finding was normal or abnormal, because an examination that states the vessel relationship is normal did assess the vessels. Findings and adequacy statements (the whirlpool sign, limiting bowel gas) are coded clause-by-clause with negation and co-occurrence handling, as noted in the table.</w:t>
+        <w:t xml:space="preserve">Content coding was applied to the concatenated findings and conclusion text of each index unit. For CT and the upper gastrointestinal series it used the patterns below. For ultrasound the patterns were applied first and then replaced by the two-reader manual coding of Section K, because checking them against the reports showed that the vessel pattern also counted mentions of the vessels that did not address their relationship; the ultrasound rows are retained for comparison, and Table S2 gives their agreement with the manual coding. Examination type and bedside performance are taken from the examination name for all modalities. The index unit is the examination episode closest to operation: all reports of that modality issued on that calendar day are pooled, because the department routinely issues separate gastrointestinal and great-vessel reports for one ultrasound session. Patterns are regular expressions over the Chinese source text. Table S1 gives an English translation of the terms each pattern matches, and the original regular expressions are deposited unchanged in </w:t>
+      </w:r>
+      <w:r>
+        <w:rPr>
+          <w:rFonts w:ascii="Courier New" w:hAnsi="Courier New"/>
+        </w:rPr>
+        <w:t>Supplement_1_classifier.py</w:t>
+      </w:r>
+      <w:r>
+        <w:t xml:space="preserve"> (variable </w:t>
+      </w:r>
+      <w:r>
+        <w:rPr>
+          <w:rFonts w:ascii="Courier New" w:hAnsi="Courier New"/>
+        </w:rPr>
+        <w:t>CONTENT_PATTERNS</w:t>
+      </w:r>
+      <w:r>
+        <w:t>). Technique elements (duodenal segments, the mesenteric vessels, enteric fluid, dynamic and compression technique, color Doppler, cecal position) are coded on mention, whether the finding was normal or abnormal, because an examination that states the vessel relationship is normal did assess the vessels. Findings and adequacy statements (the whirlpool sign, limiting bowel gas) are coded clause-by-clause with negation and co-occurrence handling, as noted in the table.</w:t>
       </w:r>
     </w:p>
     <w:p>
@@ -570,7 +597,7 @@
         <w:rPr>
           <w:b/>
         </w:rPr>
-        <w:t>Table S1. Report-content audit patterns</w:t>
+        <w:t>Table S1. Report-content audit patterns, in English translation (original regular expressions in Supplement_1_classifier.py)</w:t>
       </w:r>
     </w:p>
     <w:tbl>
@@ -666,7 +693,7 @@
                 <w:i w:val="0"/>
                 <w:sz w:val="17"/>
               </w:rPr>
-              <w:t>Regular expression (source text)</w:t>
+              <w:t>Terms matched (English translation of the Chinese-language pattern)</w:t>
             </w:r>
           </w:p>
         </w:tc>
@@ -743,7 +770,7 @@
                 <w:i w:val="0"/>
                 <w:sz w:val="17"/>
               </w:rPr>
-              <w:t>十二指肠水平部|十二指肠水平段|十二指肠横部|十二指肠第三段|(?&lt;![弓])横部|水平部</w:t>
+              <w:t>"horizontal portion", "horizontal segment", "transverse portion" or "third segment" of the duodenum; or "transverse portion" or "horizontal portion" on its own, except "transverse portion" directly preceded by the character for "arch" (transverse portion of the aortic arch)</w:t>
             </w:r>
           </w:p>
         </w:tc>
@@ -820,7 +847,7 @@
                 <w:i w:val="0"/>
                 <w:sz w:val="17"/>
               </w:rPr>
-              <w:t>十二指肠空肠曲|屈氏|Treitz|十二指肠悬韧带|十二指肠[-—与和]?空肠交界</w:t>
+              <w:t>"duodenojejunal flexure"; the Chinese short form of the ligament of Treitz; "Treitz"; "suspensory ligament of the duodenum"; "duodenum-jejunum junction" (with an optional hyphen, "with" or "and" between the two words)</w:t>
             </w:r>
           </w:p>
         </w:tc>
@@ -897,7 +924,7 @@
                 <w:i w:val="0"/>
                 <w:sz w:val="17"/>
               </w:rPr>
-              <w:t>十二指肠</w:t>
+              <w:t>"duodenum" (any mention)</w:t>
             </w:r>
           </w:p>
         </w:tc>
@@ -974,7 +1001,7 @@
                 <w:i w:val="0"/>
                 <w:sz w:val="17"/>
               </w:rPr>
-              <w:t>肠系膜上动、?静脉|肠系膜上动静脉|肠系膜上动脉|肠系膜上静脉|肠系膜血管|系膜血管|SMA|SMV; excluding matches whose only context is 左肾静脉 / 胡桃夹 / 肾静脉受压 with no whirlpool term</w:t>
+              <w:t>"superior mesenteric artery and vein" (with or without a separating enumeration comma); "superior mesenteric artery"; "superior mesenteric vein"; "mesenteric vessels"; SMA; SMV; excluding matches whose only context is the left renal vein, nutcracker phenomenon or renal-vein compression with no whirlpool term</w:t>
             </w:r>
           </w:p>
         </w:tc>
@@ -1051,7 +1078,7 @@
                 <w:i w:val="0"/>
                 <w:sz w:val="17"/>
               </w:rPr>
-              <w:t>(?:静脉|动脉)[^。；\n]{0,10}(?:换位|反位|倒置|关系异常|异常关系)|静脉位于[^。；\n]{0,8}左|动脉位于[^。；\n]{0,8}右</w:t>
+              <w:t>"vein" or "artery" followed within 10 characters in the same clause by "transposition", "reversed position", "inversion", "abnormal relationship" (either word order); or "vein located" followed within 8 characters in the same clause by "left"; or "artery located" followed within 8 characters in the same clause by "right"</w:t>
             </w:r>
           </w:p>
         </w:tc>
@@ -1128,7 +1155,7 @@
                 <w:i w:val="0"/>
                 <w:sz w:val="17"/>
               </w:rPr>
-              <w:t>漩涡|旋涡|涡流|螺旋; counted only where no negation (未见|未探及|未显示|未发现|无明显|不明显|未闻) occurs in the 12 characters preceding the match within the same clause</w:t>
+              <w:t>"whirlpool" (two written forms of the Chinese word), "eddy flow", "spiral"; counted only where none of the negation cues "not seen", "not detected", "not shown", "not found", "no obvious", "not obvious", "not heard" occurs in the 12 characters preceding the match within the same clause</w:t>
             </w:r>
           </w:p>
         </w:tc>
@@ -1205,7 +1232,7 @@
                 <w:i w:val="0"/>
                 <w:sz w:val="17"/>
               </w:rPr>
-              <w:t>饮水|口服[^。；\n]{0,6}(?:水|液|造影剂)|注水|注入|胃内注|温开水|经胃管</w:t>
+              <w:t>"drinking water"; "oral" followed within 6 characters by "water", "fluid" or "contrast agent"; "water injection"; "injection"; "injection into the stomach"; "warm boiled water"; "via gastric tube"</w:t>
             </w:r>
           </w:p>
         </w:tc>
@@ -1282,7 +1309,7 @@
                 <w:i w:val="0"/>
                 <w:sz w:val="17"/>
               </w:rPr>
-              <w:t>动态|实时观察|连续观察</w:t>
+              <w:t>"dynamic"; "real-time observation"; "continuous observation"</w:t>
             </w:r>
           </w:p>
         </w:tc>
@@ -1359,7 +1386,7 @@
                 <w:i w:val="0"/>
                 <w:sz w:val="17"/>
               </w:rPr>
-              <w:t>加压|探头压|压迫探查</w:t>
+              <w:t>"compression"; "probe pressure"; "compression examination"</w:t>
             </w:r>
           </w:p>
         </w:tc>
@@ -1436,7 +1463,7 @@
                 <w:i w:val="0"/>
                 <w:sz w:val="17"/>
               </w:rPr>
-              <w:t>CDFI|彩色多普勒|多普勒</w:t>
+              <w:t>CDFI; "color Doppler"; "Doppler"</w:t>
             </w:r>
           </w:p>
         </w:tc>
@@ -1513,7 +1540,7 @@
                 <w:i w:val="0"/>
                 <w:sz w:val="17"/>
               </w:rPr>
-              <w:t>clause containing both (肠气|积气|气体干扰|气体遮挡|气体遮盖|气体较多|气强反射|充满气体) and (干扰|遮挡|遮盖|显示不清|显示欠清|探及?不满意|不满意)</w:t>
+              <w:t>clause containing both a gas term ("bowel gas", "accumulated gas", "gas interference", "gas obscuring", "gas covering", "abundant gas", "strongly reflective gas echoes", "filled with gas") and an interference term ("interference", "obscuring", "covering", "poorly displayed", "incompletely displayed", "unsatisfactory visualization", "unsatisfactory")</w:t>
             </w:r>
           </w:p>
         </w:tc>
@@ -1590,7 +1617,7 @@
                 <w:i w:val="0"/>
                 <w:sz w:val="17"/>
               </w:rPr>
-              <w:t>回盲</w:t>
+              <w:t>"ileocecal" (cecal region)</w:t>
             </w:r>
           </w:p>
         </w:tc>
@@ -1667,7 +1694,7 @@
                 <w:i w:val="0"/>
                 <w:sz w:val="17"/>
               </w:rPr>
-              <w:t>床旁 (in the examination name)</w:t>
+              <w:t>"bedside" (in the examination name)</w:t>
             </w:r>
           </w:p>
         </w:tc>
@@ -1744,7 +1771,7 @@
                 <w:i w:val="0"/>
                 <w:sz w:val="17"/>
               </w:rPr>
-              <w:t>腹部大血管 (in the examination name)</w:t>
+              <w:t>"abdominal great vessels" (in the examination name)</w:t>
             </w:r>
           </w:p>
         </w:tc>
@@ -1821,7 +1848,7 @@
                 <w:i w:val="0"/>
                 <w:sz w:val="17"/>
               </w:rPr>
-              <w:t>胃肠道 (in the examination name)</w:t>
+              <w:t>"gastrointestinal tract" (in the examination name)</w:t>
             </w:r>
           </w:p>
         </w:tc>
@@ -1898,7 +1925,7 @@
                 <w:i w:val="0"/>
                 <w:sz w:val="17"/>
               </w:rPr>
-              <w:t>增强 (in the examination name)</w:t>
+              <w:t>"enhanced" (in the examination name)</w:t>
             </w:r>
           </w:p>
         </w:tc>
@@ -1975,7 +2002,7 @@
                 <w:i w:val="0"/>
                 <w:sz w:val="17"/>
               </w:rPr>
-              <w:t>三维重建 (in the examination name)</w:t>
+              <w:t>"three-dimensional reconstruction" (in the examination name)</w:t>
             </w:r>
           </w:p>
         </w:tc>
@@ -2052,7 +2079,7 @@
                 <w:i w:val="0"/>
                 <w:sz w:val="17"/>
               </w:rPr>
-              <w:t>空肠曲|屈氏|Treitz|悬韧带|十二指肠[-—与和]?空肠交界</w:t>
+              <w:t>"jejunal flexure"; the Chinese short form of the ligament of Treitz; "Treitz"; "suspensory ligament"; "duodenum-jejunum junction" (with an optional hyphen, "with" or "and" between the two words)</w:t>
             </w:r>
           </w:p>
         </w:tc>
@@ -2129,7 +2156,7 @@
                 <w:i w:val="0"/>
                 <w:sz w:val="17"/>
               </w:rPr>
-              <w:t>弹簧|螺旋|绞索|盘曲</w:t>
+              <w:t>"spring"; "spiral"; "noose-like twist"; "coiled"</w:t>
             </w:r>
           </w:p>
         </w:tc>
@@ -2206,7 +2233,7 @@
                 <w:i w:val="0"/>
                 <w:sz w:val="17"/>
               </w:rPr>
-              <w:t>空肠.{0,10}(位于|居|偏)</w:t>
+              <w:t>"jejunum" followed within 10 characters by "located in", "situated in" or "deviated"</w:t>
             </w:r>
           </w:p>
         </w:tc>
@@ -2283,7 +2310,7 @@
                 <w:i w:val="0"/>
                 <w:sz w:val="17"/>
               </w:rPr>
-              <w:t>全消化道 (in the examination name)</w:t>
+              <w:t>"whole gastrointestinal tract" (in the examination name)</w:t>
             </w:r>
           </w:p>
         </w:tc>
@@ -2360,7 +2387,7 @@
                 <w:i w:val="0"/>
                 <w:sz w:val="17"/>
               </w:rPr>
-              <w:t>钡 (in the examination name)</w:t>
+              <w:t>"barium" (in the examination name)</w:t>
             </w:r>
           </w:p>
         </w:tc>
@@ -2376,7 +2403,7 @@
         <w:spacing w:after="160"/>
       </w:pPr>
       <w:r>
-        <w:t>Three properties of this audit qualify its interpretation. First, it records what was written, and is a lower bound on what was performed. The D3 pattern accepts the four terms used for the third portion in this corpus (水平部, 水平段, 横部, 第三段); the negative lookbehind excludes 主动脉弓横部, and the enteric-fluid pattern requires a statement that fluid was given, so observed luminal fluid without a stated route was not counted. Second, patterns were fixed only after enumerating every occurrence of the relevant vocabulary in the corpus and inspecting each match: a pattern for the abdominal aorta was discarded because two of its three matches were cardiac or renal-vein findings, the mesenteric-vessel pattern was extended to 肠系膜上动、静脉 and 肠系膜上动静脉 and excludes an isolated left-renal-vein measurement, and the duodenojejunal-junction pattern was extended to the 交界 wording used in this corpus. Third, for ultrasound the mention-level patterns agreed with the manual coding in 117 of 117 examinations for D3, the duodenojejunal junction and enteric fluid, but in only 108 for the artery–vein relationship, 111 for limiting bowel gas and 114 for the whirlpool (Table S2), which is why the manual coding is used.</w:t>
+        <w:t>Three properties of this audit qualify its interpretation. First, it records what was written, and is a lower bound on what was performed. The D3 pattern accepts the four terms used for the third portion in this corpus ("horizontal portion", "horizontal segment", "transverse portion", "third segment"); the negative lookbehind excludes "transverse portion of the aortic arch", and the enteric-fluid pattern requires a statement that fluid was given, so observed luminal fluid without a stated route was not counted. Second, patterns were fixed only after enumerating every occurrence of the relevant vocabulary in the corpus and inspecting each match: a pattern for the abdominal aorta was discarded because two of its three matches were cardiac or renal-vein findings, the mesenteric-vessel pattern was extended to the wordings "superior mesenteric artery, vein" (with an enumeration comma) and "superior mesenteric artery and vein" and excludes an isolated left-renal-vein measurement, and the duodenojejunal-junction pattern was extended to the "junction" wording used in this corpus. Third, for ultrasound the mention-level patterns agreed with the manual coding in 117 of 117 examinations for D3, the duodenojejunal junction and enteric fluid, but in only 108 for the artery–vein relationship, 111 for limiting bowel gas and 114 for the whirlpool (Table S2), which is why the manual coding is used.</w:t>
       </w:r>
     </w:p>
     <w:p>

</xml_diff>